<commit_message>
second commit of my final project
</commit_message>
<xml_diff>
--- a/PROG103_FinalProject_BIT1201_Group 2.docx
+++ b/PROG103_FinalProject_BIT1201_Group 2.docx
@@ -347,7 +347,23 @@
           <w:sz w:val="22"/>
         </w:rPr>
         <w:tab/>
-        <w:t xml:space="preserve">        :  </w:t>
+        <w:t xml:space="preserve">      </w:t>
+      </w:r>
+      <w:proofErr w:type="gramStart"/>
+      <w:r>
+        <w:rPr>
+          <w:rFonts w:ascii="Tahoma" w:hAnsi="Tahoma" w:cs="Tahoma"/>
+          <w:sz w:val="22"/>
+        </w:rPr>
+        <w:t xml:space="preserve">  :</w:t>
+      </w:r>
+      <w:proofErr w:type="gramEnd"/>
+      <w:r>
+        <w:rPr>
+          <w:rFonts w:ascii="Tahoma" w:hAnsi="Tahoma" w:cs="Tahoma"/>
+          <w:sz w:val="22"/>
+        </w:rPr>
+        <w:t xml:space="preserve">  </w:t>
       </w:r>
       <w:r>
         <w:rPr>
@@ -1576,8 +1592,17 @@
           <w:rFonts w:ascii="Tahoma" w:hAnsi="Tahoma" w:cs="Tahoma"/>
           <w:sz w:val="18"/>
         </w:rPr>
-        <w:t>…………………..</w:t>
-      </w:r>
+        <w:t>………………</w:t>
+      </w:r>
+      <w:proofErr w:type="gramStart"/>
+      <w:r>
+        <w:rPr>
+          <w:rFonts w:ascii="Tahoma" w:hAnsi="Tahoma" w:cs="Tahoma"/>
+          <w:sz w:val="18"/>
+        </w:rPr>
+        <w:t>…..</w:t>
+      </w:r>
+      <w:proofErr w:type="gramEnd"/>
     </w:p>
     <w:p>
       <w:pPr>
@@ -1944,7 +1969,23 @@
                 <w:rFonts w:ascii="Tahoma" w:hAnsi="Tahoma" w:cs="Tahoma"/>
                 <w:sz w:val="18"/>
               </w:rPr>
-              <w:t xml:space="preserve">DATE   :  </w:t>
+              <w:t xml:space="preserve">DATE </w:t>
+            </w:r>
+            <w:proofErr w:type="gramStart"/>
+            <w:r>
+              <w:rPr>
+                <w:rFonts w:ascii="Tahoma" w:hAnsi="Tahoma" w:cs="Tahoma"/>
+                <w:sz w:val="18"/>
+              </w:rPr>
+              <w:t xml:space="preserve">  :</w:t>
+            </w:r>
+            <w:proofErr w:type="gramEnd"/>
+            <w:r>
+              <w:rPr>
+                <w:rFonts w:ascii="Tahoma" w:hAnsi="Tahoma" w:cs="Tahoma"/>
+                <w:sz w:val="18"/>
+              </w:rPr>
+              <w:t xml:space="preserve">  </w:t>
             </w:r>
           </w:p>
           <w:p>
@@ -1963,7 +2004,23 @@
                 <w:rFonts w:ascii="Tahoma" w:hAnsi="Tahoma" w:cs="Tahoma"/>
                 <w:sz w:val="18"/>
               </w:rPr>
-              <w:t xml:space="preserve">TIME    : </w:t>
+              <w:t xml:space="preserve">TIME  </w:t>
+            </w:r>
+            <w:proofErr w:type="gramStart"/>
+            <w:r>
+              <w:rPr>
+                <w:rFonts w:ascii="Tahoma" w:hAnsi="Tahoma" w:cs="Tahoma"/>
+                <w:sz w:val="18"/>
+              </w:rPr>
+              <w:t xml:space="preserve">  :</w:t>
+            </w:r>
+            <w:proofErr w:type="gramEnd"/>
+            <w:r>
+              <w:rPr>
+                <w:rFonts w:ascii="Tahoma" w:hAnsi="Tahoma" w:cs="Tahoma"/>
+                <w:sz w:val="18"/>
+              </w:rPr>
+              <w:t xml:space="preserve"> </w:t>
             </w:r>
           </w:p>
           <w:p>
@@ -1982,7 +2039,23 @@
                 <w:rFonts w:ascii="Tahoma" w:hAnsi="Tahoma" w:cs="Tahoma"/>
                 <w:sz w:val="18"/>
               </w:rPr>
-              <w:t xml:space="preserve">RECEIVER’S NAME : </w:t>
+              <w:t xml:space="preserve">RECEIVER’S </w:t>
+            </w:r>
+            <w:proofErr w:type="gramStart"/>
+            <w:r>
+              <w:rPr>
+                <w:rFonts w:ascii="Tahoma" w:hAnsi="Tahoma" w:cs="Tahoma"/>
+                <w:sz w:val="18"/>
+              </w:rPr>
+              <w:t>NAME :</w:t>
+            </w:r>
+            <w:proofErr w:type="gramEnd"/>
+            <w:r>
+              <w:rPr>
+                <w:rFonts w:ascii="Tahoma" w:hAnsi="Tahoma" w:cs="Tahoma"/>
+                <w:sz w:val="18"/>
+              </w:rPr>
+              <w:t xml:space="preserve"> </w:t>
             </w:r>
           </w:p>
         </w:tc>
@@ -2098,7 +2171,25 @@
           <w:sz w:val="20"/>
           <w:szCs w:val="20"/>
         </w:rPr>
-        <w:t>……………………………..…….……</w:t>
+        <w:t>…………………………</w:t>
+      </w:r>
+      <w:proofErr w:type="gramStart"/>
+      <w:r>
+        <w:rPr>
+          <w:rFonts w:ascii="Tahoma" w:hAnsi="Tahoma" w:cs="Tahoma"/>
+          <w:sz w:val="20"/>
+          <w:szCs w:val="20"/>
+        </w:rPr>
+        <w:t>…..</w:t>
+      </w:r>
+      <w:proofErr w:type="gramEnd"/>
+      <w:r>
+        <w:rPr>
+          <w:rFonts w:ascii="Tahoma" w:hAnsi="Tahoma" w:cs="Tahoma"/>
+          <w:sz w:val="20"/>
+          <w:szCs w:val="20"/>
+        </w:rPr>
+        <w:t>…….……</w:t>
       </w:r>
       <w:r>
         <w:rPr>
@@ -2135,6 +2226,7 @@
         </w:rPr>
         <w:t>CONCLUSION</w:t>
       </w:r>
+      <w:proofErr w:type="gramStart"/>
       <w:r>
         <w:rPr>
           <w:rFonts w:ascii="Tahoma" w:hAnsi="Tahoma" w:cs="Tahoma"/>
@@ -2143,6 +2235,7 @@
         </w:rPr>
         <w:t>…..</w:t>
       </w:r>
+      <w:proofErr w:type="gramEnd"/>
       <w:r>
         <w:rPr>
           <w:rFonts w:ascii="Tahoma" w:hAnsi="Tahoma" w:cs="Tahoma"/>
@@ -2200,7 +2293,25 @@
           <w:sz w:val="20"/>
           <w:szCs w:val="20"/>
         </w:rPr>
-        <w:t>…………………………………………..…………</w:t>
+        <w:t>………………………………………</w:t>
+      </w:r>
+      <w:proofErr w:type="gramStart"/>
+      <w:r>
+        <w:rPr>
+          <w:rFonts w:ascii="Tahoma" w:hAnsi="Tahoma" w:cs="Tahoma"/>
+          <w:sz w:val="20"/>
+          <w:szCs w:val="20"/>
+        </w:rPr>
+        <w:t>…..</w:t>
+      </w:r>
+      <w:proofErr w:type="gramEnd"/>
+      <w:r>
+        <w:rPr>
+          <w:rFonts w:ascii="Tahoma" w:hAnsi="Tahoma" w:cs="Tahoma"/>
+          <w:sz w:val="20"/>
+          <w:szCs w:val="20"/>
+        </w:rPr>
+        <w:t>…………</w:t>
       </w:r>
       <w:r>
         <w:rPr>
@@ -3103,56 +3214,112 @@
         <w:rPr>
           <w:rFonts w:ascii="Tahoma" w:eastAsia="Tahoma" w:hAnsi="Tahoma" w:cs="Tahoma"/>
         </w:rPr>
-        <w:t>register_patient</w:t>
+        <w:t>register_</w:t>
+      </w:r>
+      <w:proofErr w:type="gramStart"/>
+      <w:r>
+        <w:rPr>
+          <w:rFonts w:ascii="Tahoma" w:eastAsia="Tahoma" w:hAnsi="Tahoma" w:cs="Tahoma"/>
+        </w:rPr>
+        <w:t>patient</w:t>
       </w:r>
       <w:proofErr w:type="spellEnd"/>
       <w:r>
         <w:rPr>
           <w:rFonts w:ascii="Tahoma" w:eastAsia="Tahoma" w:hAnsi="Tahoma" w:cs="Tahoma"/>
         </w:rPr>
-        <w:t xml:space="preserve">(), </w:t>
+        <w:t>(</w:t>
+      </w:r>
+      <w:proofErr w:type="gramEnd"/>
+      <w:r>
+        <w:rPr>
+          <w:rFonts w:ascii="Tahoma" w:eastAsia="Tahoma" w:hAnsi="Tahoma" w:cs="Tahoma"/>
+        </w:rPr>
+        <w:t xml:space="preserve">), </w:t>
       </w:r>
       <w:proofErr w:type="spellStart"/>
       <w:r>
         <w:rPr>
           <w:rFonts w:ascii="Tahoma" w:eastAsia="Tahoma" w:hAnsi="Tahoma" w:cs="Tahoma"/>
         </w:rPr>
-        <w:t>book_appointment</w:t>
+        <w:t>book_</w:t>
+      </w:r>
+      <w:proofErr w:type="gramStart"/>
+      <w:r>
+        <w:rPr>
+          <w:rFonts w:ascii="Tahoma" w:eastAsia="Tahoma" w:hAnsi="Tahoma" w:cs="Tahoma"/>
+        </w:rPr>
+        <w:t>appointment</w:t>
       </w:r>
       <w:proofErr w:type="spellEnd"/>
       <w:r>
         <w:rPr>
           <w:rFonts w:ascii="Tahoma" w:eastAsia="Tahoma" w:hAnsi="Tahoma" w:cs="Tahoma"/>
         </w:rPr>
-        <w:t xml:space="preserve">(), </w:t>
+        <w:t>(</w:t>
+      </w:r>
+      <w:proofErr w:type="gramEnd"/>
+      <w:r>
+        <w:rPr>
+          <w:rFonts w:ascii="Tahoma" w:eastAsia="Tahoma" w:hAnsi="Tahoma" w:cs="Tahoma"/>
+        </w:rPr>
+        <w:t xml:space="preserve">), </w:t>
       </w:r>
       <w:proofErr w:type="spellStart"/>
       <w:r>
         <w:rPr>
           <w:rFonts w:ascii="Tahoma" w:eastAsia="Tahoma" w:hAnsi="Tahoma" w:cs="Tahoma"/>
         </w:rPr>
-        <w:t>reschedule_appointment</w:t>
+        <w:t>reschedule_</w:t>
+      </w:r>
+      <w:proofErr w:type="gramStart"/>
+      <w:r>
+        <w:rPr>
+          <w:rFonts w:ascii="Tahoma" w:eastAsia="Tahoma" w:hAnsi="Tahoma" w:cs="Tahoma"/>
+        </w:rPr>
+        <w:t>appointment</w:t>
       </w:r>
       <w:proofErr w:type="spellEnd"/>
       <w:r>
         <w:rPr>
           <w:rFonts w:ascii="Tahoma" w:eastAsia="Tahoma" w:hAnsi="Tahoma" w:cs="Tahoma"/>
         </w:rPr>
-        <w:t xml:space="preserve">(), and </w:t>
+        <w:t>(</w:t>
+      </w:r>
+      <w:proofErr w:type="gramEnd"/>
+      <w:r>
+        <w:rPr>
+          <w:rFonts w:ascii="Tahoma" w:eastAsia="Tahoma" w:hAnsi="Tahoma" w:cs="Tahoma"/>
+        </w:rPr>
+        <w:t xml:space="preserve">), and </w:t>
       </w:r>
       <w:proofErr w:type="spellStart"/>
       <w:r>
         <w:rPr>
           <w:rFonts w:ascii="Tahoma" w:eastAsia="Tahoma" w:hAnsi="Tahoma" w:cs="Tahoma"/>
         </w:rPr>
-        <w:t>cancel_appointment</w:t>
+        <w:t>cancel_</w:t>
+      </w:r>
+      <w:proofErr w:type="gramStart"/>
+      <w:r>
+        <w:rPr>
+          <w:rFonts w:ascii="Tahoma" w:eastAsia="Tahoma" w:hAnsi="Tahoma" w:cs="Tahoma"/>
+        </w:rPr>
+        <w:t>appointment</w:t>
       </w:r>
       <w:proofErr w:type="spellEnd"/>
       <w:r>
         <w:rPr>
           <w:rFonts w:ascii="Tahoma" w:eastAsia="Tahoma" w:hAnsi="Tahoma" w:cs="Tahoma"/>
         </w:rPr>
-        <w:t>(). Each function connects to the database, executes SQL commands, and closes the connection to prevent corruption.</w:t>
+        <w:t>(</w:t>
+      </w:r>
+      <w:proofErr w:type="gramEnd"/>
+      <w:r>
+        <w:rPr>
+          <w:rFonts w:ascii="Tahoma" w:eastAsia="Tahoma" w:hAnsi="Tahoma" w:cs="Tahoma"/>
+        </w:rPr>
+        <w:t>). Each function connects to the database, executes SQL commands, and closes the connection to prevent corruption.</w:t>
       </w:r>
     </w:p>
     <w:p>
@@ -3802,6 +3969,7 @@
       <w:r>
         <w:rPr>
           <w:rFonts w:ascii="Tahoma" w:eastAsia="Tahoma" w:hAnsi="Tahoma" w:cs="Tahoma"/>
+          <w:noProof/>
         </w:rPr>
         <w:drawing>
           <wp:anchor distT="0" distB="0" distL="114300" distR="114300" simplePos="0" relativeHeight="251671552" behindDoc="0" locked="0" layoutInCell="1" allowOverlap="1" wp14:anchorId="60BCE0E6" wp14:editId="35654887">
@@ -3878,6 +4046,7 @@
           <w:rFonts w:ascii="Tahoma" w:eastAsia="Tahoma" w:hAnsi="Tahoma" w:cs="Tahoma"/>
           <w:b/>
           <w:bCs/>
+          <w:noProof/>
           <w:u w:val="single"/>
         </w:rPr>
         <w:drawing>
@@ -4501,6 +4670,108 @@
     <w:p>
       <w:pPr>
         <w:spacing w:line="276" w:lineRule="auto"/>
+        <w:rPr>
+          <w:rFonts w:ascii="Tahoma" w:eastAsia="Tahoma" w:hAnsi="Tahoma" w:cs="Tahoma"/>
+          <w:u w:val="single"/>
+        </w:rPr>
+      </w:pPr>
+      <w:r>
+        <w:rPr>
+          <w:rFonts w:ascii="Tahoma" w:eastAsia="Tahoma" w:hAnsi="Tahoma" w:cs="Tahoma"/>
+          <w:u w:val="single"/>
+        </w:rPr>
+        <w:t>Git Hub</w:t>
+      </w:r>
+      <w:r>
+        <w:rPr>
+          <w:rFonts w:ascii="Tahoma" w:eastAsia="Tahoma" w:hAnsi="Tahoma" w:cs="Tahoma"/>
+          <w:u w:val="single"/>
+        </w:rPr>
+        <w:t xml:space="preserve"> r</w:t>
+      </w:r>
+      <w:r>
+        <w:rPr>
+          <w:rFonts w:ascii="Tahoma" w:eastAsia="Tahoma" w:hAnsi="Tahoma" w:cs="Tahoma"/>
+          <w:u w:val="single"/>
+        </w:rPr>
+        <w:t>epository</w:t>
+      </w:r>
+      <w:r>
+        <w:rPr>
+          <w:rFonts w:ascii="Tahoma" w:eastAsia="Tahoma" w:hAnsi="Tahoma" w:cs="Tahoma"/>
+          <w:u w:val="single"/>
+        </w:rPr>
+        <w:t xml:space="preserve"> </w:t>
+      </w:r>
+      <w:r>
+        <w:rPr>
+          <w:rFonts w:ascii="Tahoma" w:eastAsia="Tahoma" w:hAnsi="Tahoma" w:cs="Tahoma"/>
+          <w:u w:val="single"/>
+        </w:rPr>
+        <w:t>link</w:t>
+      </w:r>
+    </w:p>
+    <w:p>
+      <w:pPr>
+        <w:spacing w:line="276" w:lineRule="auto"/>
+        <w:rPr>
+          <w:rFonts w:ascii="Tahoma" w:eastAsia="Tahoma" w:hAnsi="Tahoma" w:cs="Tahoma"/>
+          <w:sz w:val="20"/>
+          <w:szCs w:val="20"/>
+        </w:rPr>
+      </w:pPr>
+      <w:hyperlink r:id="rId16" w:history="1">
+        <w:r>
+          <w:rPr>
+            <w:rStyle w:val="Hyperlink"/>
+            <w:rFonts w:ascii="Tahoma" w:eastAsia="Tahoma" w:hAnsi="Tahoma" w:cs="Tahoma"/>
+            <w:sz w:val="20"/>
+            <w:szCs w:val="20"/>
+            <w:u w:val="none"/>
+          </w:rPr>
+          <w:t>https://github.com/cliffordjones954</w:t>
+        </w:r>
+        <w:r>
+          <w:rPr>
+            <w:rStyle w:val="Hyperlink"/>
+            <w:rFonts w:ascii="Tahoma" w:eastAsia="Tahoma" w:hAnsi="Tahoma" w:cs="Tahoma"/>
+            <w:sz w:val="20"/>
+            <w:szCs w:val="20"/>
+            <w:u w:val="none"/>
+          </w:rPr>
+          <w:t>-</w:t>
+        </w:r>
+        <w:r>
+          <w:rPr>
+            <w:rStyle w:val="Hyperlink"/>
+            <w:rFonts w:ascii="Tahoma" w:eastAsia="Tahoma" w:hAnsi="Tahoma" w:cs="Tahoma"/>
+            <w:sz w:val="20"/>
+            <w:szCs w:val="20"/>
+            <w:u w:val="none"/>
+          </w:rPr>
+          <w:t>creator/PROG103_FinalProject_BIT1201_Group2</w:t>
+        </w:r>
+      </w:hyperlink>
+    </w:p>
+    <w:p>
+      <w:pPr>
+        <w:spacing w:line="276" w:lineRule="auto"/>
+        <w:rPr>
+          <w:rFonts w:ascii="Tahoma" w:eastAsia="Tahoma" w:hAnsi="Tahoma" w:cs="Tahoma"/>
+        </w:rPr>
+      </w:pPr>
+    </w:p>
+    <w:p>
+      <w:pPr>
+        <w:spacing w:line="276" w:lineRule="auto"/>
+        <w:rPr>
+          <w:rFonts w:ascii="Tahoma" w:eastAsia="Tahoma" w:hAnsi="Tahoma" w:cs="Tahoma"/>
+        </w:rPr>
+      </w:pPr>
+    </w:p>
+    <w:p>
+      <w:pPr>
+        <w:spacing w:line="276" w:lineRule="auto"/>
         <w:jc w:val="center"/>
         <w:rPr>
           <w:rFonts w:ascii="Tahoma" w:eastAsia="Tahoma" w:hAnsi="Tahoma" w:cs="Tahoma"/>
@@ -4629,73 +4900,14 @@
           <w:u w:val="single"/>
         </w:rPr>
       </w:pPr>
-    </w:p>
-    <w:p>
-      <w:pPr>
-        <w:spacing w:line="276" w:lineRule="auto"/>
-        <w:jc w:val="center"/>
-        <w:rPr>
-          <w:rFonts w:ascii="Tahoma" w:eastAsia="Tahoma" w:hAnsi="Tahoma" w:cs="Tahoma"/>
-          <w:b/>
-          <w:bCs/>
-          <w:u w:val="single"/>
-        </w:rPr>
-      </w:pPr>
-    </w:p>
-    <w:p>
-      <w:pPr>
-        <w:spacing w:line="276" w:lineRule="auto"/>
-        <w:jc w:val="center"/>
-        <w:rPr>
-          <w:rFonts w:ascii="Tahoma" w:eastAsia="Tahoma" w:hAnsi="Tahoma" w:cs="Tahoma"/>
-          <w:b/>
-          <w:bCs/>
-          <w:u w:val="single"/>
-        </w:rPr>
-      </w:pPr>
-    </w:p>
-    <w:p>
-      <w:pPr>
-        <w:spacing w:line="276" w:lineRule="auto"/>
-        <w:jc w:val="center"/>
-        <w:rPr>
-          <w:rFonts w:ascii="Tahoma" w:eastAsia="Tahoma" w:hAnsi="Tahoma" w:cs="Tahoma"/>
-          <w:b/>
-          <w:bCs/>
-          <w:u w:val="single"/>
-        </w:rPr>
-      </w:pPr>
-    </w:p>
-    <w:p>
-      <w:pPr>
-        <w:spacing w:line="276" w:lineRule="auto"/>
-        <w:jc w:val="center"/>
-        <w:rPr>
-          <w:rFonts w:ascii="Tahoma" w:eastAsia="Tahoma" w:hAnsi="Tahoma" w:cs="Tahoma"/>
-          <w:b/>
-          <w:bCs/>
-          <w:u w:val="single"/>
-        </w:rPr>
-      </w:pPr>
-    </w:p>
-    <w:p>
-      <w:pPr>
-        <w:spacing w:line="276" w:lineRule="auto"/>
-        <w:jc w:val="center"/>
-        <w:rPr>
-          <w:rFonts w:ascii="Tahoma" w:eastAsia="Tahoma" w:hAnsi="Tahoma" w:cs="Tahoma"/>
-          <w:b/>
-          <w:bCs/>
-          <w:u w:val="single"/>
-        </w:rPr>
-      </w:pPr>
-      <w:r>
-        <w:rPr>
-          <w:rFonts w:ascii="Tahoma" w:eastAsia="Tahoma" w:hAnsi="Tahoma" w:cs="Tahoma"/>
-          <w:b/>
-          <w:bCs/>
-          <w:u w:val="single"/>
-        </w:rPr>
+      <w:r>
+        <w:rPr>
+          <w:rFonts w:ascii="Tahoma" w:eastAsia="Tahoma" w:hAnsi="Tahoma" w:cs="Tahoma"/>
+          <w:b/>
+          <w:bCs/>
+          <w:u w:val="single"/>
+        </w:rPr>
+        <w:lastRenderedPageBreak/>
         <w:t>Conclusion</w:t>
       </w:r>
     </w:p>
@@ -5327,6 +5539,7 @@
           <w:bCs/>
           <w:u w:val="single"/>
         </w:rPr>
+        <w:lastRenderedPageBreak/>
         <w:t xml:space="preserve">References </w:t>
       </w:r>
     </w:p>
@@ -5402,7 +5615,7 @@
       </w:pPr>
     </w:p>
     <w:sectPr>
-      <w:footerReference w:type="default" r:id="rId16"/>
+      <w:footerReference w:type="default" r:id="rId17"/>
       <w:pgSz w:w="12240" w:h="15840"/>
       <w:pgMar w:top="851" w:right="1797" w:bottom="851" w:left="1797" w:header="567" w:footer="567" w:gutter="0"/>
       <w:cols w:space="720"/>
@@ -8414,7 +8627,6 @@
   <w:style w:type="character" w:default="1" w:styleId="DefaultParagraphFont">
     <w:name w:val="Default Paragraph Font"/>
     <w:uiPriority w:val="1"/>
-    <w:semiHidden/>
     <w:unhideWhenUsed/>
   </w:style>
   <w:style w:type="table" w:default="1" w:styleId="TableNormal">
@@ -8602,6 +8814,18 @@
     <w:rPr>
       <w:color w:val="605E5C"/>
       <w:shd w:val="clear" w:color="auto" w:fill="E1DFDD"/>
+    </w:rPr>
+  </w:style>
+  <w:style w:type="character" w:styleId="FollowedHyperlink">
+    <w:name w:val="FollowedHyperlink"/>
+    <w:basedOn w:val="DefaultParagraphFont"/>
+    <w:uiPriority w:val="99"/>
+    <w:semiHidden/>
+    <w:unhideWhenUsed/>
+    <w:rsid w:val="001A3B3A"/>
+    <w:rPr>
+      <w:color w:val="954F72" w:themeColor="followedHyperlink"/>
+      <w:u w:val="single"/>
     </w:rPr>
   </w:style>
 </w:styles>

</xml_diff>

<commit_message>
added the github link to the document
</commit_message>
<xml_diff>
--- a/PROG103_FinalProject_BIT1201_Group 2.docx
+++ b/PROG103_FinalProject_BIT1201_Group 2.docx
@@ -347,7 +347,23 @@
           <w:sz w:val="22"/>
         </w:rPr>
         <w:tab/>
-        <w:t xml:space="preserve">        :  </w:t>
+        <w:t xml:space="preserve">      </w:t>
+      </w:r>
+      <w:proofErr w:type="gramStart"/>
+      <w:r>
+        <w:rPr>
+          <w:rFonts w:ascii="Tahoma" w:hAnsi="Tahoma" w:cs="Tahoma"/>
+          <w:sz w:val="22"/>
+        </w:rPr>
+        <w:t xml:space="preserve">  :</w:t>
+      </w:r>
+      <w:proofErr w:type="gramEnd"/>
+      <w:r>
+        <w:rPr>
+          <w:rFonts w:ascii="Tahoma" w:hAnsi="Tahoma" w:cs="Tahoma"/>
+          <w:sz w:val="22"/>
+        </w:rPr>
+        <w:t xml:space="preserve">  </w:t>
       </w:r>
       <w:r>
         <w:rPr>
@@ -1574,8 +1590,17 @@
           <w:rFonts w:ascii="Tahoma" w:hAnsi="Tahoma" w:cs="Tahoma"/>
           <w:sz w:val="18"/>
         </w:rPr>
-        <w:t>…………………..</w:t>
-      </w:r>
+        <w:t>………………</w:t>
+      </w:r>
+      <w:proofErr w:type="gramStart"/>
+      <w:r>
+        <w:rPr>
+          <w:rFonts w:ascii="Tahoma" w:hAnsi="Tahoma" w:cs="Tahoma"/>
+          <w:sz w:val="18"/>
+        </w:rPr>
+        <w:t>…..</w:t>
+      </w:r>
+      <w:proofErr w:type="gramEnd"/>
     </w:p>
     <w:p>
       <w:pPr>
@@ -1942,7 +1967,23 @@
                 <w:rFonts w:ascii="Tahoma" w:hAnsi="Tahoma" w:cs="Tahoma"/>
                 <w:sz w:val="18"/>
               </w:rPr>
-              <w:t xml:space="preserve">DATE   :  </w:t>
+              <w:t xml:space="preserve">DATE </w:t>
+            </w:r>
+            <w:proofErr w:type="gramStart"/>
+            <w:r>
+              <w:rPr>
+                <w:rFonts w:ascii="Tahoma" w:hAnsi="Tahoma" w:cs="Tahoma"/>
+                <w:sz w:val="18"/>
+              </w:rPr>
+              <w:t xml:space="preserve">  :</w:t>
+            </w:r>
+            <w:proofErr w:type="gramEnd"/>
+            <w:r>
+              <w:rPr>
+                <w:rFonts w:ascii="Tahoma" w:hAnsi="Tahoma" w:cs="Tahoma"/>
+                <w:sz w:val="18"/>
+              </w:rPr>
+              <w:t xml:space="preserve">  </w:t>
             </w:r>
           </w:p>
           <w:p>
@@ -1961,7 +2002,23 @@
                 <w:rFonts w:ascii="Tahoma" w:hAnsi="Tahoma" w:cs="Tahoma"/>
                 <w:sz w:val="18"/>
               </w:rPr>
-              <w:t xml:space="preserve">TIME    : </w:t>
+              <w:t xml:space="preserve">TIME  </w:t>
+            </w:r>
+            <w:proofErr w:type="gramStart"/>
+            <w:r>
+              <w:rPr>
+                <w:rFonts w:ascii="Tahoma" w:hAnsi="Tahoma" w:cs="Tahoma"/>
+                <w:sz w:val="18"/>
+              </w:rPr>
+              <w:t xml:space="preserve">  :</w:t>
+            </w:r>
+            <w:proofErr w:type="gramEnd"/>
+            <w:r>
+              <w:rPr>
+                <w:rFonts w:ascii="Tahoma" w:hAnsi="Tahoma" w:cs="Tahoma"/>
+                <w:sz w:val="18"/>
+              </w:rPr>
+              <w:t xml:space="preserve"> </w:t>
             </w:r>
           </w:p>
           <w:p>
@@ -1980,7 +2037,23 @@
                 <w:rFonts w:ascii="Tahoma" w:hAnsi="Tahoma" w:cs="Tahoma"/>
                 <w:sz w:val="18"/>
               </w:rPr>
-              <w:t xml:space="preserve">RECEIVER’S NAME : </w:t>
+              <w:t xml:space="preserve">RECEIVER’S </w:t>
+            </w:r>
+            <w:proofErr w:type="gramStart"/>
+            <w:r>
+              <w:rPr>
+                <w:rFonts w:ascii="Tahoma" w:hAnsi="Tahoma" w:cs="Tahoma"/>
+                <w:sz w:val="18"/>
+              </w:rPr>
+              <w:t>NAME :</w:t>
+            </w:r>
+            <w:proofErr w:type="gramEnd"/>
+            <w:r>
+              <w:rPr>
+                <w:rFonts w:ascii="Tahoma" w:hAnsi="Tahoma" w:cs="Tahoma"/>
+                <w:sz w:val="18"/>
+              </w:rPr>
+              <w:t xml:space="preserve"> </w:t>
             </w:r>
           </w:p>
         </w:tc>
@@ -2096,74 +2169,78 @@
           <w:sz w:val="20"/>
           <w:szCs w:val="20"/>
         </w:rPr>
-        <w:t>……………………………..…….……</w:t>
-      </w:r>
+        <w:t>…………………………</w:t>
+      </w:r>
+      <w:proofErr w:type="gramStart"/>
       <w:r>
         <w:rPr>
           <w:rFonts w:ascii="Tahoma" w:hAnsi="Tahoma" w:cs="Tahoma"/>
           <w:sz w:val="20"/>
           <w:szCs w:val="20"/>
         </w:rPr>
-        <w:t>…</w:t>
-      </w:r>
+        <w:t>…..</w:t>
+      </w:r>
+      <w:proofErr w:type="gramEnd"/>
       <w:r>
         <w:rPr>
           <w:rFonts w:ascii="Tahoma" w:hAnsi="Tahoma" w:cs="Tahoma"/>
           <w:sz w:val="20"/>
           <w:szCs w:val="20"/>
         </w:rPr>
-        <w:t xml:space="preserve">……PAGE 4 </w:t>
-      </w:r>
-    </w:p>
-    <w:p>
-      <w:pPr>
-        <w:spacing w:line="276" w:lineRule="auto"/>
-        <w:jc w:val="both"/>
+        <w:t>…….……</w:t>
+      </w:r>
+      <w:r>
         <w:rPr>
           <w:rFonts w:ascii="Tahoma" w:hAnsi="Tahoma" w:cs="Tahoma"/>
           <w:sz w:val="20"/>
           <w:szCs w:val="20"/>
         </w:rPr>
-      </w:pPr>
+        <w:t>…</w:t>
+      </w:r>
       <w:r>
         <w:rPr>
           <w:rFonts w:ascii="Tahoma" w:hAnsi="Tahoma" w:cs="Tahoma"/>
           <w:sz w:val="20"/>
           <w:szCs w:val="20"/>
         </w:rPr>
-        <w:t>CONCLUSION</w:t>
-      </w:r>
-      <w:r>
+        <w:t xml:space="preserve">……PAGE 4 </w:t>
+      </w:r>
+    </w:p>
+    <w:p>
+      <w:pPr>
+        <w:spacing w:line="276" w:lineRule="auto"/>
+        <w:jc w:val="both"/>
         <w:rPr>
           <w:rFonts w:ascii="Tahoma" w:hAnsi="Tahoma" w:cs="Tahoma"/>
           <w:sz w:val="20"/>
           <w:szCs w:val="20"/>
         </w:rPr>
-        <w:t>…..</w:t>
-      </w:r>
+      </w:pPr>
       <w:r>
         <w:rPr>
           <w:rFonts w:ascii="Tahoma" w:hAnsi="Tahoma" w:cs="Tahoma"/>
           <w:sz w:val="20"/>
           <w:szCs w:val="20"/>
         </w:rPr>
-        <w:t>…………………………………….……………</w:t>
-      </w:r>
+        <w:t>CONCLUSION</w:t>
+      </w:r>
+      <w:proofErr w:type="gramStart"/>
       <w:r>
         <w:rPr>
           <w:rFonts w:ascii="Tahoma" w:hAnsi="Tahoma" w:cs="Tahoma"/>
           <w:sz w:val="20"/>
           <w:szCs w:val="20"/>
         </w:rPr>
-        <w:t>’</w:t>
-      </w:r>
+        <w:t>…..</w:t>
+      </w:r>
+      <w:proofErr w:type="gramEnd"/>
       <w:r>
         <w:rPr>
           <w:rFonts w:ascii="Tahoma" w:hAnsi="Tahoma" w:cs="Tahoma"/>
           <w:sz w:val="20"/>
           <w:szCs w:val="20"/>
         </w:rPr>
-        <w:t xml:space="preserve">……PAGE </w:t>
+        <w:t>…………………………………….……………</w:t>
       </w:r>
       <w:r>
         <w:rPr>
@@ -2171,42 +2248,42 @@
           <w:sz w:val="20"/>
           <w:szCs w:val="20"/>
         </w:rPr>
-        <w:t>10</w:t>
-      </w:r>
-    </w:p>
-    <w:p>
-      <w:pPr>
-        <w:spacing w:line="276" w:lineRule="auto"/>
-        <w:jc w:val="both"/>
+        <w:t>’</w:t>
+      </w:r>
+      <w:r>
         <w:rPr>
           <w:rFonts w:ascii="Tahoma" w:hAnsi="Tahoma" w:cs="Tahoma"/>
           <w:sz w:val="20"/>
           <w:szCs w:val="20"/>
         </w:rPr>
-      </w:pPr>
+        <w:t xml:space="preserve">……PAGE </w:t>
+      </w:r>
       <w:r>
         <w:rPr>
           <w:rFonts w:ascii="Tahoma" w:hAnsi="Tahoma" w:cs="Tahoma"/>
           <w:sz w:val="20"/>
           <w:szCs w:val="20"/>
         </w:rPr>
-        <w:t>REFERENCES</w:t>
-      </w:r>
-      <w:r>
+        <w:t>10</w:t>
+      </w:r>
+    </w:p>
+    <w:p>
+      <w:pPr>
+        <w:spacing w:line="276" w:lineRule="auto"/>
+        <w:jc w:val="both"/>
         <w:rPr>
           <w:rFonts w:ascii="Tahoma" w:hAnsi="Tahoma" w:cs="Tahoma"/>
           <w:sz w:val="20"/>
           <w:szCs w:val="20"/>
         </w:rPr>
-        <w:t>….</w:t>
-      </w:r>
+      </w:pPr>
       <w:r>
         <w:rPr>
           <w:rFonts w:ascii="Tahoma" w:hAnsi="Tahoma" w:cs="Tahoma"/>
           <w:sz w:val="20"/>
           <w:szCs w:val="20"/>
         </w:rPr>
-        <w:t>…………………………………………..…………</w:t>
+        <w:t>REFERENCES</w:t>
       </w:r>
       <w:r>
         <w:rPr>
@@ -2214,7 +2291,7 @@
           <w:sz w:val="20"/>
           <w:szCs w:val="20"/>
         </w:rPr>
-        <w:t>.</w:t>
+        <w:t>….</w:t>
       </w:r>
       <w:r>
         <w:rPr>
@@ -2222,33 +2299,67 @@
           <w:sz w:val="20"/>
           <w:szCs w:val="20"/>
         </w:rPr>
-        <w:t xml:space="preserve">…PAGE </w:t>
-      </w:r>
+        <w:t>………………………………………</w:t>
+      </w:r>
+      <w:proofErr w:type="gramStart"/>
       <w:r>
         <w:rPr>
           <w:rFonts w:ascii="Tahoma" w:hAnsi="Tahoma" w:cs="Tahoma"/>
           <w:sz w:val="20"/>
           <w:szCs w:val="20"/>
         </w:rPr>
-        <w:t>11</w:t>
-      </w:r>
-    </w:p>
-    <w:p>
-      <w:pPr>
-        <w:spacing w:line="276" w:lineRule="auto"/>
-        <w:jc w:val="both"/>
+        <w:t>…..</w:t>
+      </w:r>
+      <w:proofErr w:type="gramEnd"/>
+      <w:r>
         <w:rPr>
           <w:rFonts w:ascii="Tahoma" w:hAnsi="Tahoma" w:cs="Tahoma"/>
           <w:sz w:val="20"/>
           <w:szCs w:val="20"/>
         </w:rPr>
-      </w:pPr>
+        <w:t>…………</w:t>
+      </w:r>
       <w:r>
         <w:rPr>
           <w:rFonts w:ascii="Tahoma" w:hAnsi="Tahoma" w:cs="Tahoma"/>
           <w:sz w:val="20"/>
           <w:szCs w:val="20"/>
         </w:rPr>
+        <w:t>.</w:t>
+      </w:r>
+      <w:r>
+        <w:rPr>
+          <w:rFonts w:ascii="Tahoma" w:hAnsi="Tahoma" w:cs="Tahoma"/>
+          <w:sz w:val="20"/>
+          <w:szCs w:val="20"/>
+        </w:rPr>
+        <w:t xml:space="preserve">…PAGE </w:t>
+      </w:r>
+      <w:r>
+        <w:rPr>
+          <w:rFonts w:ascii="Tahoma" w:hAnsi="Tahoma" w:cs="Tahoma"/>
+          <w:sz w:val="20"/>
+          <w:szCs w:val="20"/>
+        </w:rPr>
+        <w:t>11</w:t>
+      </w:r>
+    </w:p>
+    <w:p>
+      <w:pPr>
+        <w:spacing w:line="276" w:lineRule="auto"/>
+        <w:jc w:val="both"/>
+        <w:rPr>
+          <w:rFonts w:ascii="Tahoma" w:hAnsi="Tahoma" w:cs="Tahoma"/>
+          <w:sz w:val="20"/>
+          <w:szCs w:val="20"/>
+        </w:rPr>
+      </w:pPr>
+      <w:r>
+        <w:rPr>
+          <w:rFonts w:ascii="Tahoma" w:hAnsi="Tahoma" w:cs="Tahoma"/>
+          <w:sz w:val="20"/>
+          <w:szCs w:val="20"/>
+        </w:rPr>
         <w:br w:type="page"/>
       </w:r>
     </w:p>
@@ -2295,19 +2406,9 @@
           <w:sz w:val="22"/>
           <w:szCs w:val="22"/>
         </w:rPr>
-        <w:t>The AuraClinic Healthcare Management System is a fully featured, GUI-based desktop application developed in Python using the tkinter framework. It was built to address real-world inefficiencies in patient registration, appointment scheduling, and healthcare record management commonly encountered in small to medium-sized clinics.</w:t>
-      </w:r>
-    </w:p>
-    <w:p>
-      <w:pPr>
-        <w:spacing w:before="60" w:after="60" w:line="276" w:lineRule="auto"/>
-        <w:jc w:val="both"/>
-        <w:rPr>
-          <w:rFonts w:ascii="Tahoma" w:hAnsi="Tahoma" w:cs="Tahoma"/>
-          <w:sz w:val="22"/>
-          <w:szCs w:val="22"/>
-        </w:rPr>
-      </w:pPr>
+        <w:t xml:space="preserve">The </w:t>
+      </w:r>
+      <w:proofErr w:type="spellStart"/>
       <w:r>
         <w:rPr>
           <w:rFonts w:ascii="Tahoma" w:eastAsia="Calibri" w:hAnsi="Tahoma" w:cs="Tahoma"/>
@@ -2315,19 +2416,9 @@
           <w:sz w:val="22"/>
           <w:szCs w:val="22"/>
         </w:rPr>
-        <w:t>The system replaces paper-based and error-prone manual processes with a clean, navigable interface. After a secure login, staff members can register and manage patient records, book appointments with integrated time-slot availability checking, view and update appointment records, and search patients using multiple filter criteria. The project demonstrates the practical application of structured programming principles including modular design, object-oriented encapsulation, data validation, and event-driven programming.</w:t>
-      </w:r>
-    </w:p>
-    <w:p>
-      <w:pPr>
-        <w:spacing w:before="60" w:after="60" w:line="276" w:lineRule="auto"/>
-        <w:jc w:val="both"/>
-        <w:rPr>
-          <w:rFonts w:ascii="Tahoma" w:hAnsi="Tahoma" w:cs="Tahoma"/>
-          <w:sz w:val="22"/>
-          <w:szCs w:val="22"/>
-        </w:rPr>
-      </w:pPr>
+        <w:t>AuraClinic</w:t>
+      </w:r>
+      <w:proofErr w:type="spellEnd"/>
       <w:r>
         <w:rPr>
           <w:rFonts w:ascii="Tahoma" w:eastAsia="Calibri" w:hAnsi="Tahoma" w:cs="Tahoma"/>
@@ -2335,6 +2426,66 @@
           <w:sz w:val="22"/>
           <w:szCs w:val="22"/>
         </w:rPr>
+        <w:t xml:space="preserve"> Healthcare Management System is a fully featured, GUI-based desktop application developed in Python using the </w:t>
+      </w:r>
+      <w:proofErr w:type="spellStart"/>
+      <w:r>
+        <w:rPr>
+          <w:rFonts w:ascii="Tahoma" w:eastAsia="Calibri" w:hAnsi="Tahoma" w:cs="Tahoma"/>
+          <w:color w:val="1A2E44"/>
+          <w:sz w:val="22"/>
+          <w:szCs w:val="22"/>
+        </w:rPr>
+        <w:t>tkinter</w:t>
+      </w:r>
+      <w:proofErr w:type="spellEnd"/>
+      <w:r>
+        <w:rPr>
+          <w:rFonts w:ascii="Tahoma" w:eastAsia="Calibri" w:hAnsi="Tahoma" w:cs="Tahoma"/>
+          <w:color w:val="1A2E44"/>
+          <w:sz w:val="22"/>
+          <w:szCs w:val="22"/>
+        </w:rPr>
+        <w:t xml:space="preserve"> framework. It was built to address real-world inefficiencies in patient registration, appointment scheduling, and healthcare record management commonly encountered in small to medium-sized clinics.</w:t>
+      </w:r>
+    </w:p>
+    <w:p>
+      <w:pPr>
+        <w:spacing w:before="60" w:after="60" w:line="276" w:lineRule="auto"/>
+        <w:jc w:val="both"/>
+        <w:rPr>
+          <w:rFonts w:ascii="Tahoma" w:hAnsi="Tahoma" w:cs="Tahoma"/>
+          <w:sz w:val="22"/>
+          <w:szCs w:val="22"/>
+        </w:rPr>
+      </w:pPr>
+      <w:r>
+        <w:rPr>
+          <w:rFonts w:ascii="Tahoma" w:eastAsia="Calibri" w:hAnsi="Tahoma" w:cs="Tahoma"/>
+          <w:color w:val="1A2E44"/>
+          <w:sz w:val="22"/>
+          <w:szCs w:val="22"/>
+        </w:rPr>
+        <w:t>The system replaces paper-based and error-prone manual processes with a clean, navigable interface. After a secure login, staff members can register and manage patient records, book appointments with integrated time-slot availability checking, view and update appointment records, and search patients using multiple filter criteria. The project demonstrates the practical application of structured programming principles including modular design, object-oriented encapsulation, data validation, and event-driven programming.</w:t>
+      </w:r>
+    </w:p>
+    <w:p>
+      <w:pPr>
+        <w:spacing w:before="60" w:after="60" w:line="276" w:lineRule="auto"/>
+        <w:jc w:val="both"/>
+        <w:rPr>
+          <w:rFonts w:ascii="Tahoma" w:hAnsi="Tahoma" w:cs="Tahoma"/>
+          <w:sz w:val="22"/>
+          <w:szCs w:val="22"/>
+        </w:rPr>
+      </w:pPr>
+      <w:r>
+        <w:rPr>
+          <w:rFonts w:ascii="Tahoma" w:eastAsia="Calibri" w:hAnsi="Tahoma" w:cs="Tahoma"/>
+          <w:color w:val="1A2E44"/>
+          <w:sz w:val="22"/>
+          <w:szCs w:val="22"/>
+        </w:rPr>
         <w:t>This report covers the problem addressed, the system’s design and architecture, the structured programming principles applied, and its alignment with the United Nations Sustainable Development Goals (SDGs).</w:t>
       </w:r>
     </w:p>
@@ -2811,7 +2962,27 @@
           <w:sz w:val="22"/>
           <w:szCs w:val="22"/>
         </w:rPr>
-        <w:t>When the application starts, the user is presented with the AuraClinic login window. This window has a split-panel layout with the clinic illustration on the left and the login form on the right. The form accepts a username and password and validates them against a built-in credential dictionary. Three demo accounts are provided for testing: admin with password admin123, doctor with password doc2025, and nurse with password nurse2025. On a successful login the login window is hidden and the main application shell is opened.</w:t>
+        <w:t xml:space="preserve">When the application starts, the user is presented with the </w:t>
+      </w:r>
+      <w:proofErr w:type="spellStart"/>
+      <w:r>
+        <w:rPr>
+          <w:rFonts w:ascii="Tahoma" w:eastAsia="Calibri" w:hAnsi="Tahoma" w:cs="Tahoma"/>
+          <w:color w:val="1A2E44"/>
+          <w:sz w:val="22"/>
+          <w:szCs w:val="22"/>
+        </w:rPr>
+        <w:t>AuraClinic</w:t>
+      </w:r>
+      <w:proofErr w:type="spellEnd"/>
+      <w:r>
+        <w:rPr>
+          <w:rFonts w:ascii="Tahoma" w:eastAsia="Calibri" w:hAnsi="Tahoma" w:cs="Tahoma"/>
+          <w:color w:val="1A2E44"/>
+          <w:sz w:val="22"/>
+          <w:szCs w:val="22"/>
+        </w:rPr>
+        <w:t xml:space="preserve"> login window. This window has a split-panel layout with the clinic illustration on the left and the login form on the right. The form accepts a username and password and validates them against a built-in credential dictionary. Three demo accounts are provided for testing: admin with password admin123, doctor with password doc2025, and nurse with password nurse2025. On a successful login the login window is hidden and the main application shell is opened.</w:t>
       </w:r>
     </w:p>
     <w:p>
@@ -3224,7 +3395,27 @@
           <w:sz w:val="22"/>
           <w:szCs w:val="22"/>
         </w:rPr>
-        <w:t>The AuraClinic system aligns directly with two United Nations Sustainable Development Goals.</w:t>
+        <w:t xml:space="preserve">The </w:t>
+      </w:r>
+      <w:proofErr w:type="spellStart"/>
+      <w:r>
+        <w:rPr>
+          <w:rFonts w:ascii="Tahoma" w:eastAsia="Calibri" w:hAnsi="Tahoma" w:cs="Tahoma"/>
+          <w:color w:val="1A2E44"/>
+          <w:sz w:val="22"/>
+          <w:szCs w:val="22"/>
+        </w:rPr>
+        <w:t>AuraClinic</w:t>
+      </w:r>
+      <w:proofErr w:type="spellEnd"/>
+      <w:r>
+        <w:rPr>
+          <w:rFonts w:ascii="Tahoma" w:eastAsia="Calibri" w:hAnsi="Tahoma" w:cs="Tahoma"/>
+          <w:color w:val="1A2E44"/>
+          <w:sz w:val="22"/>
+          <w:szCs w:val="22"/>
+        </w:rPr>
+        <w:t xml:space="preserve"> system aligns directly with two United Nations Sustainable Development Goals.</w:t>
       </w:r>
     </w:p>
     <w:p>
@@ -4041,6 +4232,7 @@
         </w:rPr>
         <w:t xml:space="preserve">Screenshot </w:t>
       </w:r>
+      <w:proofErr w:type="gramStart"/>
       <w:r>
         <w:rPr>
           <w:rFonts w:ascii="Tahoma" w:eastAsia="Tahoma" w:hAnsi="Tahoma" w:cs="Tahoma"/>
@@ -4065,7 +4257,16 @@
           <w:sz w:val="22"/>
           <w:szCs w:val="22"/>
         </w:rPr>
-        <w:t>This function handles the user login process. It first checks whether the username and password fields are empty and displays warning messages if they are. It then verifies the entered credentials against the stored valid users; if they are correct, it opens the dashboard, otherwise it shows an error message and clears the password field so the user can try again.</w:t>
+        <w:t>This</w:t>
+      </w:r>
+      <w:proofErr w:type="gramEnd"/>
+      <w:r>
+        <w:rPr>
+          <w:rFonts w:ascii="Tahoma" w:eastAsia="Tahoma" w:hAnsi="Tahoma" w:cs="Tahoma"/>
+          <w:sz w:val="22"/>
+          <w:szCs w:val="22"/>
+        </w:rPr>
+        <w:t xml:space="preserve"> function handles the user login process. It first checks whether the username and password fields are empty and displays warning messages if they are. It then verifies the entered credentials against the stored valid users; if they are correct, it opens the dashboard, otherwise it shows an error message and clears the password field so the user can try again.</w:t>
       </w:r>
     </w:p>
     <w:p>
@@ -4453,6 +4654,17 @@
     <w:p>
       <w:pPr>
         <w:spacing w:line="276" w:lineRule="auto"/>
+        <w:rPr>
+          <w:rFonts w:ascii="Tahoma" w:eastAsia="Tahoma" w:hAnsi="Tahoma" w:cs="Tahoma"/>
+          <w:b/>
+          <w:bCs/>
+          <w:u w:val="single"/>
+        </w:rPr>
+      </w:pPr>
+    </w:p>
+    <w:p>
+      <w:pPr>
+        <w:spacing w:line="276" w:lineRule="auto"/>
         <w:jc w:val="center"/>
         <w:rPr>
           <w:rFonts w:ascii="Tahoma" w:eastAsia="Tahoma" w:hAnsi="Tahoma" w:cs="Tahoma"/>
@@ -4468,35 +4680,86 @@
         <w:jc w:val="center"/>
         <w:rPr>
           <w:rFonts w:ascii="Tahoma" w:eastAsia="Tahoma" w:hAnsi="Tahoma" w:cs="Tahoma"/>
-          <w:b/>
-          <w:bCs/>
-          <w:u w:val="single"/>
-        </w:rPr>
-      </w:pPr>
-    </w:p>
-    <w:p>
-      <w:pPr>
-        <w:spacing w:line="276" w:lineRule="auto"/>
-        <w:jc w:val="center"/>
-        <w:rPr>
-          <w:rFonts w:ascii="Tahoma" w:eastAsia="Tahoma" w:hAnsi="Tahoma" w:cs="Tahoma"/>
-          <w:b/>
-          <w:bCs/>
-          <w:u w:val="single"/>
-        </w:rPr>
-      </w:pPr>
-    </w:p>
-    <w:p>
-      <w:pPr>
-        <w:spacing w:line="276" w:lineRule="auto"/>
-        <w:jc w:val="center"/>
-        <w:rPr>
-          <w:rFonts w:ascii="Tahoma" w:eastAsia="Tahoma" w:hAnsi="Tahoma" w:cs="Tahoma"/>
-          <w:b/>
-          <w:bCs/>
-          <w:u w:val="single"/>
-        </w:rPr>
-      </w:pPr>
+          <w:sz w:val="22"/>
+          <w:szCs w:val="22"/>
+          <w:u w:val="single"/>
+        </w:rPr>
+      </w:pPr>
+      <w:r>
+        <w:rPr>
+          <w:rFonts w:ascii="Tahoma" w:eastAsia="Tahoma" w:hAnsi="Tahoma" w:cs="Tahoma"/>
+          <w:sz w:val="22"/>
+          <w:szCs w:val="22"/>
+          <w:u w:val="single"/>
+        </w:rPr>
+        <w:t xml:space="preserve">Git Hub </w:t>
+      </w:r>
+      <w:r>
+        <w:rPr>
+          <w:rFonts w:ascii="Tahoma" w:eastAsia="Tahoma" w:hAnsi="Tahoma" w:cs="Tahoma"/>
+          <w:sz w:val="22"/>
+          <w:szCs w:val="22"/>
+          <w:u w:val="single"/>
+        </w:rPr>
+        <w:t>repositor</w:t>
+      </w:r>
+      <w:r>
+        <w:rPr>
+          <w:rFonts w:ascii="Tahoma" w:eastAsia="Tahoma" w:hAnsi="Tahoma" w:cs="Tahoma"/>
+          <w:sz w:val="22"/>
+          <w:szCs w:val="22"/>
+          <w:u w:val="single"/>
+        </w:rPr>
+        <w:t>y</w:t>
+      </w:r>
+      <w:r>
+        <w:rPr>
+          <w:rFonts w:ascii="Tahoma" w:eastAsia="Tahoma" w:hAnsi="Tahoma" w:cs="Tahoma"/>
+          <w:sz w:val="22"/>
+          <w:szCs w:val="22"/>
+          <w:u w:val="single"/>
+        </w:rPr>
+        <w:t xml:space="preserve"> Link</w:t>
+      </w:r>
+    </w:p>
+    <w:p>
+      <w:pPr>
+        <w:spacing w:line="276" w:lineRule="auto"/>
+        <w:rPr>
+          <w:rFonts w:ascii="Tahoma" w:eastAsia="Tahoma" w:hAnsi="Tahoma" w:cs="Tahoma"/>
+          <w:sz w:val="22"/>
+          <w:szCs w:val="22"/>
+        </w:rPr>
+      </w:pPr>
+      <w:hyperlink r:id="rId17" w:history="1">
+        <w:r>
+          <w:rPr>
+            <w:rStyle w:val="Hyperlink"/>
+            <w:rFonts w:ascii="Tahoma" w:eastAsia="Tahoma" w:hAnsi="Tahoma" w:cs="Tahoma"/>
+            <w:sz w:val="22"/>
+            <w:szCs w:val="22"/>
+          </w:rPr>
+          <w:t>https://github.com/cliffordjones954-creator/PR</w:t>
+        </w:r>
+        <w:r>
+          <w:rPr>
+            <w:rStyle w:val="Hyperlink"/>
+            <w:rFonts w:ascii="Tahoma" w:eastAsia="Tahoma" w:hAnsi="Tahoma" w:cs="Tahoma"/>
+            <w:sz w:val="22"/>
+            <w:szCs w:val="22"/>
+          </w:rPr>
+          <w:t>O</w:t>
+        </w:r>
+        <w:r>
+          <w:rPr>
+            <w:rStyle w:val="Hyperlink"/>
+            <w:rFonts w:ascii="Tahoma" w:eastAsia="Tahoma" w:hAnsi="Tahoma" w:cs="Tahoma"/>
+            <w:sz w:val="22"/>
+            <w:szCs w:val="22"/>
+          </w:rPr>
+          <w:t>G103_FinalProject_BIT1201_Group2</w:t>
+        </w:r>
+      </w:hyperlink>
     </w:p>
     <w:p>
       <w:pPr>
@@ -4676,14 +4939,9 @@
           <w:sz w:val="22"/>
           <w:szCs w:val="22"/>
         </w:rPr>
-        <w:t>The AuraClinic Healthcare Management System successfully demonstrates that structured programming principles can be applied to build a complete, professional-grade desktop application. Starting from a secure login page and progressing through four fully functional management pages, the system covers patient registration, appointment booking with conflict detection, appointment lifecycle management, and advanced patient search, all within a single navigable GUI shell.</w:t>
-      </w:r>
-    </w:p>
-    <w:p>
-      <w:pPr>
-        <w:spacing w:before="60" w:after="100"/>
-        <w:jc w:val="both"/>
-      </w:pPr>
+        <w:t xml:space="preserve">The </w:t>
+      </w:r>
+      <w:proofErr w:type="spellStart"/>
       <w:r>
         <w:rPr>
           <w:rFonts w:ascii="Calibri" w:eastAsia="Calibri" w:hAnsi="Calibri" w:cs="Calibri"/>
@@ -4691,8 +4949,9 @@
           <w:sz w:val="22"/>
           <w:szCs w:val="22"/>
         </w:rPr>
-        <w:t xml:space="preserve">The project applies every core concept from PROG103. Module-level constants enforce a consistent </w:t>
-      </w:r>
+        <w:t>AuraClinic</w:t>
+      </w:r>
+      <w:proofErr w:type="spellEnd"/>
       <w:r>
         <w:rPr>
           <w:rFonts w:ascii="Calibri" w:eastAsia="Calibri" w:hAnsi="Calibri" w:cs="Calibri"/>
@@ -4700,8 +4959,14 @@
           <w:sz w:val="22"/>
           <w:szCs w:val="22"/>
         </w:rPr>
-        <w:t>color</w:t>
-      </w:r>
+        <w:t xml:space="preserve"> Healthcare Management System successfully demonstrates that structured programming principles can be applied to build a complete, professional-grade desktop application. Starting from a secure login page and progressing through four fully functional management pages, the system covers patient registration, appointment booking with conflict detection, appointment lifecycle management, and advanced patient search, all within a single navigable GUI shell.</w:t>
+      </w:r>
+    </w:p>
+    <w:p>
+      <w:pPr>
+        <w:spacing w:before="60" w:after="100"/>
+        <w:jc w:val="both"/>
+      </w:pPr>
       <w:r>
         <w:rPr>
           <w:rFonts w:ascii="Calibri" w:eastAsia="Calibri" w:hAnsi="Calibri" w:cs="Calibri"/>
@@ -4709,14 +4974,8 @@
           <w:sz w:val="22"/>
           <w:szCs w:val="22"/>
         </w:rPr>
-        <w:t xml:space="preserve"> scheme and layout across all pages. Appropriate data types are used for each field, with integers for ages, ISO strings for dates, and dictionaries for records. Decision structures validate every form submission and detect appointment conflicts before any data is written. Iteration populates every table and renders every time-slot button. Shared helper functions eliminate repetition and keep each page class focused on its own logic. Try/except blocks handle every image load and every potential runtime error. Object-oriented encapsulation keeps the four page classes independent of each other and independent of the shell that hosts them.</w:t>
-      </w:r>
-    </w:p>
-    <w:p>
-      <w:pPr>
-        <w:spacing w:before="60" w:after="100"/>
-        <w:jc w:val="both"/>
-      </w:pPr>
+        <w:t xml:space="preserve">The project applies every core concept from PROG103. Module-level constants enforce a consistent </w:t>
+      </w:r>
       <w:r>
         <w:rPr>
           <w:rFonts w:ascii="Calibri" w:eastAsia="Calibri" w:hAnsi="Calibri" w:cs="Calibri"/>
@@ -4724,7 +4983,71 @@
           <w:sz w:val="22"/>
           <w:szCs w:val="22"/>
         </w:rPr>
-        <w:t>Beyond its technical merits, AuraClinic has genuine practical relevance. Its lightweight architecture, requiring only Python 3 and Pillow, makes it deployable in clinics with limited IT infrastructure, directly contributing to SDG 3 on Good Health and Well-Being and SDG 9 on Industry, Innovation, and Infrastructure. The modular codebase is also designed for future extension. Adding an SQLite database, user roles, or printable appointment slips would each require targeted additions rather than wholesale rewrites.</w:t>
+        <w:t>color</w:t>
+      </w:r>
+      <w:r>
+        <w:rPr>
+          <w:rFonts w:ascii="Calibri" w:eastAsia="Calibri" w:hAnsi="Calibri" w:cs="Calibri"/>
+          <w:color w:val="1A2E44"/>
+          <w:sz w:val="22"/>
+          <w:szCs w:val="22"/>
+        </w:rPr>
+        <w:t xml:space="preserve"> scheme and layout across all pages. Appropriate data types are used for each field, with integers for ages, ISO strings for dates, and dictionaries for records. Decision structures validate every form submission and detect appointment conflicts before any data is written. Iteration populates every table and renders every time-slot button. Shared helper functions eliminate repetition and keep each page class focused on its own logic. Try/except blocks handle every image load and every potential runtime error. Object-oriented encapsulation keeps the </w:t>
+      </w:r>
+      <w:proofErr w:type="gramStart"/>
+      <w:r>
+        <w:rPr>
+          <w:rFonts w:ascii="Calibri" w:eastAsia="Calibri" w:hAnsi="Calibri" w:cs="Calibri"/>
+          <w:color w:val="1A2E44"/>
+          <w:sz w:val="22"/>
+          <w:szCs w:val="22"/>
+        </w:rPr>
+        <w:t>four page</w:t>
+      </w:r>
+      <w:proofErr w:type="gramEnd"/>
+      <w:r>
+        <w:rPr>
+          <w:rFonts w:ascii="Calibri" w:eastAsia="Calibri" w:hAnsi="Calibri" w:cs="Calibri"/>
+          <w:color w:val="1A2E44"/>
+          <w:sz w:val="22"/>
+          <w:szCs w:val="22"/>
+        </w:rPr>
+        <w:t xml:space="preserve"> classes independent of each other and independent of the shell that hosts them.</w:t>
+      </w:r>
+    </w:p>
+    <w:p>
+      <w:pPr>
+        <w:spacing w:before="60" w:after="100"/>
+        <w:jc w:val="both"/>
+      </w:pPr>
+      <w:r>
+        <w:rPr>
+          <w:rFonts w:ascii="Calibri" w:eastAsia="Calibri" w:hAnsi="Calibri" w:cs="Calibri"/>
+          <w:color w:val="1A2E44"/>
+          <w:sz w:val="22"/>
+          <w:szCs w:val="22"/>
+        </w:rPr>
+        <w:t xml:space="preserve">Beyond its technical merits, </w:t>
+      </w:r>
+      <w:proofErr w:type="spellStart"/>
+      <w:r>
+        <w:rPr>
+          <w:rFonts w:ascii="Calibri" w:eastAsia="Calibri" w:hAnsi="Calibri" w:cs="Calibri"/>
+          <w:color w:val="1A2E44"/>
+          <w:sz w:val="22"/>
+          <w:szCs w:val="22"/>
+        </w:rPr>
+        <w:t>AuraClinic</w:t>
+      </w:r>
+      <w:proofErr w:type="spellEnd"/>
+      <w:r>
+        <w:rPr>
+          <w:rFonts w:ascii="Calibri" w:eastAsia="Calibri" w:hAnsi="Calibri" w:cs="Calibri"/>
+          <w:color w:val="1A2E44"/>
+          <w:sz w:val="22"/>
+          <w:szCs w:val="22"/>
+        </w:rPr>
+        <w:t xml:space="preserve"> has genuine practical relevance. Its lightweight architecture, requiring only Python 3 and Pillow, makes it deployable in clinics with limited IT infrastructure, directly contributing to SDG 3 on Good Health and Well-Being and SDG 9 on Industry, Innovation, and Infrastructure. The modular codebase is also designed for future extension. Adding an SQLite database, user roles, or printable appointment slips would each require targeted additions rather than wholesale rewrites.</w:t>
       </w:r>
     </w:p>
     <w:p>
@@ -5171,7 +5494,7 @@
       </w:pPr>
     </w:p>
     <w:sectPr>
-      <w:footerReference w:type="default" r:id="rId17"/>
+      <w:footerReference w:type="default" r:id="rId18"/>
       <w:pgSz w:w="12240" w:h="15840"/>
       <w:pgMar w:top="851" w:right="1797" w:bottom="851" w:left="1797" w:header="567" w:footer="567" w:gutter="0"/>
       <w:cols w:space="720"/>
@@ -8243,7 +8566,6 @@
   <w:style w:type="character" w:default="1" w:styleId="DefaultParagraphFont">
     <w:name w:val="Default Paragraph Font"/>
     <w:uiPriority w:val="1"/>
-    <w:semiHidden/>
     <w:unhideWhenUsed/>
   </w:style>
   <w:style w:type="table" w:default="1" w:styleId="TableNormal">
@@ -8430,6 +8752,18 @@
     <w:rPr>
       <w:color w:val="605E5C"/>
       <w:shd w:val="clear" w:color="auto" w:fill="E1DFDD"/>
+    </w:rPr>
+  </w:style>
+  <w:style w:type="character" w:styleId="FollowedHyperlink">
+    <w:name w:val="FollowedHyperlink"/>
+    <w:basedOn w:val="DefaultParagraphFont"/>
+    <w:uiPriority w:val="99"/>
+    <w:semiHidden/>
+    <w:unhideWhenUsed/>
+    <w:rsid w:val="006C10E2"/>
+    <w:rPr>
+      <w:color w:val="954F72" w:themeColor="followedHyperlink"/>
+      <w:u w:val="single"/>
     </w:rPr>
   </w:style>
 </w:styles>
@@ -8692,6 +9026,10 @@
 </file>
 
 <file path=customXml/item1.xml><?xml version="1.0" encoding="utf-8"?>
+<b:Sources xmlns:b="http://schemas.openxmlformats.org/officeDocument/2006/bibliography" xmlns="http://schemas.openxmlformats.org/officeDocument/2006/bibliography" SelectedStyle="\APASixthEditionOfficeOnline.xsl" StyleName="APA" Version="6"/>
+</file>
+
+<file path=customXml/item2.xml><?xml version="1.0" encoding="utf-8"?>
 <s:customData xmlns="http://www.wps.cn/officeDocument/2013/wpsCustomData" xmlns:s="http://www.wps.cn/officeDocument/2013/wpsCustomData">
   <customSectProps>
     <customSectPr/>
@@ -8702,22 +9040,18 @@
 </s:customData>
 </file>
 
-<file path=customXml/item2.xml><?xml version="1.0" encoding="utf-8"?>
-<b:Sources xmlns:b="http://schemas.openxmlformats.org/officeDocument/2006/bibliography" xmlns="http://schemas.openxmlformats.org/officeDocument/2006/bibliography" SelectedStyle="\APASixthEditionOfficeOnline.xsl" StyleName="APA" Version="6"/>
+<file path=customXml/itemProps1.xml><?xml version="1.0" encoding="utf-8"?>
+<ds:datastoreItem xmlns:ds="http://schemas.openxmlformats.org/officeDocument/2006/customXml" ds:itemID="{84801F4B-BAFA-45E5-8C6E-7CE47E667B9D}">
+  <ds:schemaRefs>
+    <ds:schemaRef ds:uri="http://schemas.openxmlformats.org/officeDocument/2006/bibliography"/>
+  </ds:schemaRefs>
+</ds:datastoreItem>
 </file>
 
-<file path=customXml/itemProps1.xml><?xml version="1.0" encoding="utf-8"?>
+<file path=customXml/itemProps2.xml><?xml version="1.0" encoding="utf-8"?>
 <ds:datastoreItem xmlns:ds="http://schemas.openxmlformats.org/officeDocument/2006/customXml" ds:itemID="{B1977F7D-205B-4081-913C-38D41E755F92}">
   <ds:schemaRefs>
     <ds:schemaRef ds:uri="http://www.wps.cn/officeDocument/2013/wpsCustomData"/>
   </ds:schemaRefs>
 </ds:datastoreItem>
-</file>
-
-<file path=customXml/itemProps2.xml><?xml version="1.0" encoding="utf-8"?>
-<ds:datastoreItem xmlns:ds="http://schemas.openxmlformats.org/officeDocument/2006/customXml" ds:itemID="{84801F4B-BAFA-45E5-8C6E-7CE47E667B9D}">
-  <ds:schemaRefs>
-    <ds:schemaRef ds:uri="http://schemas.openxmlformats.org/officeDocument/2006/bibliography"/>
-  </ds:schemaRefs>
-</ds:datastoreItem>
 </file>
</xml_diff>